<commit_message>
update manuscript docx (abstract trimmed to JAGS 250-word limit)
</commit_message>
<xml_diff>
--- a/manuscript_JAGS_age_heterogeneity.docx
+++ b/manuscript_JAGS_age_heterogeneity.docx
@@ -94,7 +94,7 @@
         <w:t xml:space="preserve">Background/Objectives. </w:t>
       </w:r>
       <w:r>
-        <w:t xml:space="preserve">Whether the cognitive burden of COPD is uniform across the lifespan, or concentrated in younger-onset disease, is unresolved. We tested whether the COPD–cognitive-decline association is age-dependent, and whether selective survival or biologic aging explains that variation.</w:t>
+        <w:t xml:space="preserve">Whether the cognitive burden of COPD is uniform across the lifespan is unresolved. We tested whether the COPD–cognitive-decline association is age-dependent, and whether selective survival or biologic aging explains that variation.</w:t>
       </w:r>
     </w:p>
     <w:p>
@@ -122,7 +122,7 @@
         <w:t xml:space="preserve">Setting/Participants. </w:t>
       </w:r>
       <w:r>
-        <w:t xml:space="preserve">Nationally representative US adults aged ≥50 (145,731 person-wave observations; 20,863 individuals); COPD defined by self-reported ever-COPD and wave-13 physician diagnosis.</w:t>
+        <w:t xml:space="preserve">Nationally representative US adults aged ≥50 (145,731 person-wave observations; 20,863 individuals); COPD defined by self-reported ever-COPD and wave-13 diagnosis.</w:t>
       </w:r>
     </w:p>
     <w:p>
@@ -136,7 +136,7 @@
         <w:t xml:space="preserve">Measurements. </w:t>
       </w:r>
       <w:r>
-        <w:t xml:space="preserve">Outcome: cog27 (27-point TICS-based composite; cogtot sensitivity). Moderators: baseline age group (&lt;59 vs ≥59; sensitivity at empirical median 61), DunedinPACE, telomere. Selective-survival tested via inverse-probability-of-censoring weighting (IPCW) and an elder-mortality-multiplier (EMM) bound; mediation via NfL/pTau181/homocysteine.</w:t>
+        <w:t xml:space="preserve">Outcome: cog27 (27-point TICS composite; cogtot sensitivity). Moderators: baseline age (&lt;59 vs ≥59; sensitivity median 61), DunedinPACE, telomere. Selective survival via IPCW and an elder-mortality-multiplier bound; mediation via NfL/pTau181/homocysteine.</w:t>
       </w:r>
     </w:p>
     <w:p>
@@ -150,7 +150,7 @@
         <w:t xml:space="preserve">Results. </w:t>
       </w:r>
       <w:r>
-        <w:t xml:space="preserve">In the fully adjusted model, younger-onset COPD was associated with faster cognitive decline (β=−0.144, p=.111 at the 59 cut; β=−0.164, p=.045 at the empirical-median cut), whereas older-onset COPD showed no net association (β=+0.015, p=.850). The between-group Wald test was marginal (p=.187 at 59; p=.052 at median). IPCW weights (mean 0.927) implied that explaining the older-onset heterogeneity by death would require EMM≥4, far above the observed COPD excess-mortality HR (1.3–2.0). The COPD×age×DunedinPACE three-way interaction was null (p=.79–.93; minimum detectable Δβ≈0.53, underpowered). In age-stratified mediation, the biomarker pathway was significant only in older-onset patients (joint indirect effect −0.131, p=.018) and null in younger-onset patients (−0.033, p=.50).</w:t>
+        <w:t xml:space="preserve">In the fully adjusted model, younger-onset COPD was associated with faster cognitive decline (β=−0.144, p=.111 at the 59 cut; β=−0.164, p=.045 at the median cut), whereas older-onset COPD showed no net association (β=+0.015, p=.850). The between-group Wald test was marginal (p=.187 at 59; p=.052 at median). IPCW weights (mean 0.927) implied that explaining the older-onset heterogeneity by death would require EMM≥4, above the observed COPD excess-mortality HR (1.3–2.0). The COPD×age×DunedinPACE three-way interaction was null (p=.79–.93; minimum detectable Δβ≈0.53, underpowered). In age-stratified mediation, the biomarker pathway was significant only in older-onset patients (joint indirect effect −0.131, p=.018) and null in younger-onset patients (−0.033, p=.50).</w:t>
       </w:r>
     </w:p>
     <w:p>
@@ -164,7 +164,7 @@
         <w:t xml:space="preserve">Conclusion. </w:t>
       </w:r>
       <w:r>
-        <w:t xml:space="preserve">The COPD–cognitive-decline association is age-dependent: younger-onset disease carries a real, survival-independent cognitive burden, while older-onset disease is cognitively neutral after adjustment. Measured neurodegeneration biomarkers explain only the older-onset pathway, leaving the younger-onset burden mechanistically unexplained — a gap with implications for targeted cognitive screening.</w:t>
+        <w:t xml:space="preserve">The COPD–cognitive-decline association is age-dependent: younger-onset disease carries a real, survival-independent cognitive burden; older-onset disease is cognitively neutral after adjustment. Measured biomarkers explain only the older-onset pathway, leaving the younger-onset burden mechanistically unexplained — with implications for cognitive screening.</w:t>
       </w:r>
     </w:p>
     <w:p>

</xml_diff>